<commit_message>
requirement list, usecase diagram 업로드
- 토의를 통해서 최종적으로 결정된 요구사항 리스트와 유스케이스 다이어그램 업로드
</commit_message>
<xml_diff>
--- a/requirement_list.docx
+++ b/requirement_list.docx
@@ -22,6 +22,17 @@
         </w:rPr>
         <w:t>2026-1 소프트웨어공학 25조(팀 코드: 28337)</w:t>
       </w:r>
+    </w:p>
+    <w:p>
+      <w:pPr>
+        <w:jc w:val="center"/>
+        <w:rPr>
+          <w:b/>
+          <w:bCs/>
+          <w:sz w:val="32"/>
+          <w:szCs w:val="36"/>
+        </w:rPr>
+      </w:pPr>
     </w:p>
     <w:p>
       <w:pPr>
@@ -71,8 +82,8 @@
       </w:tblPr>
       <w:tblGrid>
         <w:gridCol w:w="1413"/>
-        <w:gridCol w:w="2268"/>
-        <w:gridCol w:w="5335"/>
+        <w:gridCol w:w="2410"/>
+        <w:gridCol w:w="5193"/>
       </w:tblGrid>
       <w:tr>
         <w:tc>
@@ -83,9 +94,6 @@
           <w:p>
             <w:pPr>
               <w:jc w:val="center"/>
-              <w:rPr>
-                <w:rFonts w:hint="eastAsia"/>
-              </w:rPr>
             </w:pPr>
             <w:r>
               <w:rPr>
@@ -97,7 +105,7 @@
         </w:tc>
         <w:tc>
           <w:tcPr>
-            <w:tcW w:w="2268" w:type="dxa"/>
+            <w:tcW w:w="2410" w:type="dxa"/>
             <w:shd w:val="clear" w:color="auto" w:fill="D9D9D9" w:themeFill="background1" w:themeFillShade="D9"/>
           </w:tcPr>
           <w:p>
@@ -106,9 +114,6 @@
                 <w:tab w:val="left" w:pos="1310"/>
               </w:tabs>
               <w:jc w:val="center"/>
-              <w:rPr>
-                <w:rFonts w:hint="eastAsia"/>
-              </w:rPr>
             </w:pPr>
             <w:r>
               <w:rPr>
@@ -120,15 +125,12 @@
         </w:tc>
         <w:tc>
           <w:tcPr>
-            <w:tcW w:w="5335" w:type="dxa"/>
+            <w:tcW w:w="5193" w:type="dxa"/>
             <w:shd w:val="clear" w:color="auto" w:fill="D9D9D9" w:themeFill="background1" w:themeFillShade="D9"/>
           </w:tcPr>
           <w:p>
             <w:pPr>
               <w:jc w:val="center"/>
-              <w:rPr>
-                <w:rFonts w:hint="eastAsia"/>
-              </w:rPr>
             </w:pPr>
             <w:r>
               <w:rPr>
@@ -148,9 +150,6 @@
           <w:p>
             <w:pPr>
               <w:jc w:val="center"/>
-              <w:rPr>
-                <w:rFonts w:hint="eastAsia"/>
-              </w:rPr>
             </w:pPr>
             <w:r>
               <w:rPr>
@@ -162,27 +161,22 @@
         </w:tc>
         <w:tc>
           <w:tcPr>
-            <w:tcW w:w="2268" w:type="dxa"/>
-          </w:tcPr>
-          <w:p>
-            <w:pPr>
-              <w:rPr>
-                <w:rFonts w:hint="eastAsia"/>
-              </w:rPr>
-            </w:pPr>
-          </w:p>
-        </w:tc>
-        <w:tc>
-          <w:tcPr>
-            <w:tcW w:w="5335" w:type="dxa"/>
-          </w:tcPr>
-          <w:p>
-            <w:pPr>
-              <w:rPr>
-                <w:rFonts w:hint="eastAsia"/>
-              </w:rPr>
-            </w:pPr>
-          </w:p>
+            <w:tcW w:w="2410" w:type="dxa"/>
+          </w:tcPr>
+          <w:p>
+            <w:r>
+              <w:rPr>
+                <w:rFonts w:hint="eastAsia"/>
+              </w:rPr>
+              <w:t>회원 가입</w:t>
+            </w:r>
+          </w:p>
+        </w:tc>
+        <w:tc>
+          <w:tcPr>
+            <w:tcW w:w="5193" w:type="dxa"/>
+          </w:tcPr>
+          <w:p/>
         </w:tc>
       </w:tr>
       <w:tr>
@@ -194,35 +188,27 @@
           <w:p>
             <w:pPr>
               <w:jc w:val="center"/>
-              <w:rPr>
-                <w:rFonts w:hint="eastAsia"/>
-              </w:rPr>
             </w:pPr>
           </w:p>
         </w:tc>
         <w:tc>
           <w:tcPr>
-            <w:tcW w:w="2268" w:type="dxa"/>
-          </w:tcPr>
-          <w:p>
-            <w:pPr>
-              <w:rPr>
-                <w:rFonts w:hint="eastAsia"/>
-              </w:rPr>
-            </w:pPr>
-          </w:p>
-        </w:tc>
-        <w:tc>
-          <w:tcPr>
-            <w:tcW w:w="5335" w:type="dxa"/>
-          </w:tcPr>
-          <w:p>
-            <w:pPr>
-              <w:rPr>
-                <w:rFonts w:hint="eastAsia"/>
-              </w:rPr>
-            </w:pPr>
-          </w:p>
+            <w:tcW w:w="2410" w:type="dxa"/>
+          </w:tcPr>
+          <w:p>
+            <w:r>
+              <w:rPr>
+                <w:rFonts w:hint="eastAsia"/>
+              </w:rPr>
+              <w:t>회원 탈퇴</w:t>
+            </w:r>
+          </w:p>
+        </w:tc>
+        <w:tc>
+          <w:tcPr>
+            <w:tcW w:w="5193" w:type="dxa"/>
+          </w:tcPr>
+          <w:p/>
         </w:tc>
       </w:tr>
       <w:tr>
@@ -234,35 +220,27 @@
           <w:p>
             <w:pPr>
               <w:jc w:val="center"/>
-              <w:rPr>
-                <w:rFonts w:hint="eastAsia"/>
-              </w:rPr>
             </w:pPr>
           </w:p>
         </w:tc>
         <w:tc>
           <w:tcPr>
-            <w:tcW w:w="2268" w:type="dxa"/>
-          </w:tcPr>
-          <w:p>
-            <w:pPr>
-              <w:rPr>
-                <w:rFonts w:hint="eastAsia"/>
-              </w:rPr>
-            </w:pPr>
-          </w:p>
-        </w:tc>
-        <w:tc>
-          <w:tcPr>
-            <w:tcW w:w="5335" w:type="dxa"/>
-          </w:tcPr>
-          <w:p>
-            <w:pPr>
-              <w:rPr>
-                <w:rFonts w:hint="eastAsia"/>
-              </w:rPr>
-            </w:pPr>
-          </w:p>
+            <w:tcW w:w="2410" w:type="dxa"/>
+          </w:tcPr>
+          <w:p>
+            <w:r>
+              <w:rPr>
+                <w:rFonts w:hint="eastAsia"/>
+              </w:rPr>
+              <w:t>로그인</w:t>
+            </w:r>
+          </w:p>
+        </w:tc>
+        <w:tc>
+          <w:tcPr>
+            <w:tcW w:w="5193" w:type="dxa"/>
+          </w:tcPr>
+          <w:p/>
         </w:tc>
       </w:tr>
       <w:tr>
@@ -274,9 +252,6 @@
           <w:p>
             <w:pPr>
               <w:jc w:val="center"/>
-              <w:rPr>
-                <w:rFonts w:hint="eastAsia"/>
-              </w:rPr>
             </w:pPr>
             <w:r>
               <w:rPr>
@@ -288,27 +263,22 @@
         </w:tc>
         <w:tc>
           <w:tcPr>
-            <w:tcW w:w="2268" w:type="dxa"/>
-          </w:tcPr>
-          <w:p>
-            <w:pPr>
-              <w:rPr>
-                <w:rFonts w:hint="eastAsia"/>
-              </w:rPr>
-            </w:pPr>
-          </w:p>
-        </w:tc>
-        <w:tc>
-          <w:tcPr>
-            <w:tcW w:w="5335" w:type="dxa"/>
-          </w:tcPr>
-          <w:p>
-            <w:pPr>
-              <w:rPr>
-                <w:rFonts w:hint="eastAsia"/>
-              </w:rPr>
-            </w:pPr>
-          </w:p>
+            <w:tcW w:w="2410" w:type="dxa"/>
+          </w:tcPr>
+          <w:p>
+            <w:r>
+              <w:rPr>
+                <w:rFonts w:hint="eastAsia"/>
+              </w:rPr>
+              <w:t>설문 검색</w:t>
+            </w:r>
+          </w:p>
+        </w:tc>
+        <w:tc>
+          <w:tcPr>
+            <w:tcW w:w="5193" w:type="dxa"/>
+          </w:tcPr>
+          <w:p/>
         </w:tc>
       </w:tr>
       <w:tr>
@@ -320,35 +290,27 @@
           <w:p>
             <w:pPr>
               <w:jc w:val="center"/>
-              <w:rPr>
-                <w:rFonts w:hint="eastAsia"/>
-              </w:rPr>
             </w:pPr>
           </w:p>
         </w:tc>
         <w:tc>
           <w:tcPr>
-            <w:tcW w:w="2268" w:type="dxa"/>
-          </w:tcPr>
-          <w:p>
-            <w:pPr>
-              <w:rPr>
-                <w:rFonts w:hint="eastAsia"/>
-              </w:rPr>
-            </w:pPr>
-          </w:p>
-        </w:tc>
-        <w:tc>
-          <w:tcPr>
-            <w:tcW w:w="5335" w:type="dxa"/>
-          </w:tcPr>
-          <w:p>
-            <w:pPr>
-              <w:rPr>
-                <w:rFonts w:hint="eastAsia"/>
-              </w:rPr>
-            </w:pPr>
-          </w:p>
+            <w:tcW w:w="2410" w:type="dxa"/>
+          </w:tcPr>
+          <w:p>
+            <w:r>
+              <w:rPr>
+                <w:rFonts w:hint="eastAsia"/>
+              </w:rPr>
+              <w:t>검색 설문 상세 조회</w:t>
+            </w:r>
+          </w:p>
+        </w:tc>
+        <w:tc>
+          <w:tcPr>
+            <w:tcW w:w="5193" w:type="dxa"/>
+          </w:tcPr>
+          <w:p/>
         </w:tc>
       </w:tr>
       <w:tr>
@@ -360,35 +322,27 @@
           <w:p>
             <w:pPr>
               <w:jc w:val="center"/>
-              <w:rPr>
-                <w:rFonts w:hint="eastAsia"/>
-              </w:rPr>
             </w:pPr>
           </w:p>
         </w:tc>
         <w:tc>
           <w:tcPr>
-            <w:tcW w:w="2268" w:type="dxa"/>
-          </w:tcPr>
-          <w:p>
-            <w:pPr>
-              <w:rPr>
-                <w:rFonts w:hint="eastAsia"/>
-              </w:rPr>
-            </w:pPr>
-          </w:p>
-        </w:tc>
-        <w:tc>
-          <w:tcPr>
-            <w:tcW w:w="5335" w:type="dxa"/>
-          </w:tcPr>
-          <w:p>
-            <w:pPr>
-              <w:rPr>
-                <w:rFonts w:hint="eastAsia"/>
-              </w:rPr>
-            </w:pPr>
-          </w:p>
+            <w:tcW w:w="2410" w:type="dxa"/>
+          </w:tcPr>
+          <w:p>
+            <w:r>
+              <w:rPr>
+                <w:rFonts w:hint="eastAsia"/>
+              </w:rPr>
+              <w:t>로그아웃</w:t>
+            </w:r>
+          </w:p>
+        </w:tc>
+        <w:tc>
+          <w:tcPr>
+            <w:tcW w:w="5193" w:type="dxa"/>
+          </w:tcPr>
+          <w:p/>
         </w:tc>
       </w:tr>
       <w:tr>
@@ -400,9 +354,6 @@
           <w:p>
             <w:pPr>
               <w:jc w:val="center"/>
-              <w:rPr>
-                <w:rFonts w:hint="eastAsia"/>
-              </w:rPr>
             </w:pPr>
             <w:r>
               <w:rPr>
@@ -414,27 +365,22 @@
         </w:tc>
         <w:tc>
           <w:tcPr>
-            <w:tcW w:w="2268" w:type="dxa"/>
-          </w:tcPr>
-          <w:p>
-            <w:pPr>
-              <w:rPr>
-                <w:rFonts w:hint="eastAsia"/>
-              </w:rPr>
-            </w:pPr>
-          </w:p>
-        </w:tc>
-        <w:tc>
-          <w:tcPr>
-            <w:tcW w:w="5335" w:type="dxa"/>
-          </w:tcPr>
-          <w:p>
-            <w:pPr>
-              <w:rPr>
-                <w:rFonts w:hint="eastAsia"/>
-              </w:rPr>
-            </w:pPr>
-          </w:p>
+            <w:tcW w:w="2410" w:type="dxa"/>
+          </w:tcPr>
+          <w:p>
+            <w:r>
+              <w:rPr>
+                <w:rFonts w:hint="eastAsia"/>
+              </w:rPr>
+              <w:t>응답한 설문 조회</w:t>
+            </w:r>
+          </w:p>
+        </w:tc>
+        <w:tc>
+          <w:tcPr>
+            <w:tcW w:w="5193" w:type="dxa"/>
+          </w:tcPr>
+          <w:p/>
         </w:tc>
       </w:tr>
       <w:tr>
@@ -446,35 +392,27 @@
           <w:p>
             <w:pPr>
               <w:jc w:val="center"/>
-              <w:rPr>
-                <w:rFonts w:hint="eastAsia"/>
-              </w:rPr>
             </w:pPr>
           </w:p>
         </w:tc>
         <w:tc>
           <w:tcPr>
-            <w:tcW w:w="2268" w:type="dxa"/>
-          </w:tcPr>
-          <w:p>
-            <w:pPr>
-              <w:rPr>
-                <w:rFonts w:hint="eastAsia"/>
-              </w:rPr>
-            </w:pPr>
-          </w:p>
-        </w:tc>
-        <w:tc>
-          <w:tcPr>
-            <w:tcW w:w="5335" w:type="dxa"/>
-          </w:tcPr>
-          <w:p>
-            <w:pPr>
-              <w:rPr>
-                <w:rFonts w:hint="eastAsia"/>
-              </w:rPr>
-            </w:pPr>
-          </w:p>
+            <w:tcW w:w="2410" w:type="dxa"/>
+          </w:tcPr>
+          <w:p>
+            <w:r>
+              <w:rPr>
+                <w:rFonts w:hint="eastAsia"/>
+              </w:rPr>
+              <w:t>응답 설문 수정</w:t>
+            </w:r>
+          </w:p>
+        </w:tc>
+        <w:tc>
+          <w:tcPr>
+            <w:tcW w:w="5193" w:type="dxa"/>
+          </w:tcPr>
+          <w:p/>
         </w:tc>
       </w:tr>
       <w:tr>
@@ -486,35 +424,27 @@
           <w:p>
             <w:pPr>
               <w:jc w:val="center"/>
-              <w:rPr>
-                <w:rFonts w:hint="eastAsia"/>
-              </w:rPr>
             </w:pPr>
           </w:p>
         </w:tc>
         <w:tc>
           <w:tcPr>
-            <w:tcW w:w="2268" w:type="dxa"/>
-          </w:tcPr>
-          <w:p>
-            <w:pPr>
-              <w:rPr>
-                <w:rFonts w:hint="eastAsia"/>
-              </w:rPr>
-            </w:pPr>
-          </w:p>
-        </w:tc>
-        <w:tc>
-          <w:tcPr>
-            <w:tcW w:w="5335" w:type="dxa"/>
-          </w:tcPr>
-          <w:p>
-            <w:pPr>
-              <w:rPr>
-                <w:rFonts w:hint="eastAsia"/>
-              </w:rPr>
-            </w:pPr>
-          </w:p>
+            <w:tcW w:w="2410" w:type="dxa"/>
+          </w:tcPr>
+          <w:p>
+            <w:r>
+              <w:rPr>
+                <w:rFonts w:hint="eastAsia"/>
+              </w:rPr>
+              <w:t>설문 응답</w:t>
+            </w:r>
+          </w:p>
+        </w:tc>
+        <w:tc>
+          <w:tcPr>
+            <w:tcW w:w="5193" w:type="dxa"/>
+          </w:tcPr>
+          <w:p/>
         </w:tc>
       </w:tr>
       <w:tr>
@@ -526,9 +456,6 @@
           <w:p>
             <w:pPr>
               <w:jc w:val="center"/>
-              <w:rPr>
-                <w:rFonts w:hint="eastAsia"/>
-              </w:rPr>
             </w:pPr>
             <w:proofErr w:type="spellStart"/>
             <w:r>
@@ -542,27 +469,22 @@
         </w:tc>
         <w:tc>
           <w:tcPr>
-            <w:tcW w:w="2268" w:type="dxa"/>
-          </w:tcPr>
-          <w:p>
-            <w:pPr>
-              <w:rPr>
-                <w:rFonts w:hint="eastAsia"/>
-              </w:rPr>
-            </w:pPr>
-          </w:p>
-        </w:tc>
-        <w:tc>
-          <w:tcPr>
-            <w:tcW w:w="5335" w:type="dxa"/>
-          </w:tcPr>
-          <w:p>
-            <w:pPr>
-              <w:rPr>
-                <w:rFonts w:hint="eastAsia"/>
-              </w:rPr>
-            </w:pPr>
-          </w:p>
+            <w:tcW w:w="2410" w:type="dxa"/>
+          </w:tcPr>
+          <w:p>
+            <w:r>
+              <w:rPr>
+                <w:rFonts w:hint="eastAsia"/>
+              </w:rPr>
+              <w:t>설문 등록</w:t>
+            </w:r>
+          </w:p>
+        </w:tc>
+        <w:tc>
+          <w:tcPr>
+            <w:tcW w:w="5193" w:type="dxa"/>
+          </w:tcPr>
+          <w:p/>
         </w:tc>
       </w:tr>
       <w:tr>
@@ -574,35 +496,27 @@
           <w:p>
             <w:pPr>
               <w:jc w:val="center"/>
-              <w:rPr>
-                <w:rFonts w:hint="eastAsia"/>
-              </w:rPr>
             </w:pPr>
           </w:p>
         </w:tc>
         <w:tc>
           <w:tcPr>
-            <w:tcW w:w="2268" w:type="dxa"/>
-          </w:tcPr>
-          <w:p>
-            <w:pPr>
-              <w:rPr>
-                <w:rFonts w:hint="eastAsia"/>
-              </w:rPr>
-            </w:pPr>
-          </w:p>
-        </w:tc>
-        <w:tc>
-          <w:tcPr>
-            <w:tcW w:w="5335" w:type="dxa"/>
-          </w:tcPr>
-          <w:p>
-            <w:pPr>
-              <w:rPr>
-                <w:rFonts w:hint="eastAsia"/>
-              </w:rPr>
-            </w:pPr>
-          </w:p>
+            <w:tcW w:w="2410" w:type="dxa"/>
+          </w:tcPr>
+          <w:p>
+            <w:r>
+              <w:rPr>
+                <w:rFonts w:hint="eastAsia"/>
+              </w:rPr>
+              <w:t>설문 목록 조회</w:t>
+            </w:r>
+          </w:p>
+        </w:tc>
+        <w:tc>
+          <w:tcPr>
+            <w:tcW w:w="5193" w:type="dxa"/>
+          </w:tcPr>
+          <w:p/>
         </w:tc>
       </w:tr>
       <w:tr>
@@ -614,42 +528,33 @@
           <w:p>
             <w:pPr>
               <w:jc w:val="center"/>
-              <w:rPr>
-                <w:rFonts w:hint="eastAsia"/>
-              </w:rPr>
             </w:pPr>
           </w:p>
         </w:tc>
         <w:tc>
           <w:tcPr>
-            <w:tcW w:w="2268" w:type="dxa"/>
-          </w:tcPr>
-          <w:p>
-            <w:pPr>
-              <w:rPr>
-                <w:rFonts w:hint="eastAsia"/>
-              </w:rPr>
-            </w:pPr>
-          </w:p>
-        </w:tc>
-        <w:tc>
-          <w:tcPr>
-            <w:tcW w:w="5335" w:type="dxa"/>
-          </w:tcPr>
-          <w:p>
-            <w:pPr>
-              <w:rPr>
-                <w:rFonts w:hint="eastAsia"/>
-              </w:rPr>
-            </w:pPr>
-          </w:p>
+            <w:tcW w:w="2410" w:type="dxa"/>
+          </w:tcPr>
+          <w:p>
+            <w:r>
+              <w:rPr>
+                <w:rFonts w:hint="eastAsia"/>
+              </w:rPr>
+              <w:t>통계 조회</w:t>
+            </w:r>
+          </w:p>
+        </w:tc>
+        <w:tc>
+          <w:tcPr>
+            <w:tcW w:w="5193" w:type="dxa"/>
+          </w:tcPr>
+          <w:p/>
         </w:tc>
       </w:tr>
     </w:tbl>
     <w:p>
       <w:pPr>
         <w:rPr>
-          <w:rFonts w:hint="eastAsia"/>
           <w:sz w:val="24"/>
           <w:szCs w:val="28"/>
         </w:rPr>
@@ -658,7 +563,6 @@
     <w:p>
       <w:pPr>
         <w:rPr>
-          <w:rFonts w:hint="eastAsia"/>
           <w:sz w:val="24"/>
           <w:szCs w:val="28"/>
         </w:rPr>
@@ -679,391 +583,683 @@
         <w:tblLook w:val="04A0" w:firstRow="1" w:lastRow="0" w:firstColumn="1" w:lastColumn="0" w:noHBand="0" w:noVBand="1"/>
       </w:tblPr>
       <w:tblGrid>
-        <w:gridCol w:w="2972"/>
-        <w:gridCol w:w="6044"/>
+        <w:gridCol w:w="1271"/>
+        <w:gridCol w:w="4739"/>
+        <w:gridCol w:w="3006"/>
       </w:tblGrid>
       <w:tr>
         <w:tc>
           <w:tcPr>
-            <w:tcW w:w="2972" w:type="dxa"/>
-            <w:shd w:val="clear" w:color="auto" w:fill="D9D9D9" w:themeFill="background1" w:themeFillShade="D9"/>
+            <w:tcW w:w="1271" w:type="dxa"/>
+          </w:tcPr>
+          <w:p>
+            <w:r>
+              <w:rPr>
+                <w:rFonts w:hint="eastAsia"/>
+              </w:rPr>
+              <w:t>번호</w:t>
+            </w:r>
+          </w:p>
+        </w:tc>
+        <w:tc>
+          <w:tcPr>
+            <w:tcW w:w="4739" w:type="dxa"/>
+          </w:tcPr>
+          <w:p>
+            <w:r>
+              <w:rPr>
+                <w:rFonts w:hint="eastAsia"/>
+              </w:rPr>
+              <w:t>요구사항</w:t>
+            </w:r>
+          </w:p>
+        </w:tc>
+        <w:tc>
+          <w:tcPr>
+            <w:tcW w:w="3006" w:type="dxa"/>
+          </w:tcPr>
+          <w:p>
+            <w:proofErr w:type="spellStart"/>
+            <w:r>
+              <w:rPr>
+                <w:rFonts w:hint="eastAsia"/>
+              </w:rPr>
+              <w:t>유스케이스</w:t>
+            </w:r>
+            <w:proofErr w:type="spellEnd"/>
+          </w:p>
+        </w:tc>
+      </w:tr>
+      <w:tr>
+        <w:tc>
+          <w:tcPr>
+            <w:tcW w:w="1271" w:type="dxa"/>
+          </w:tcPr>
+          <w:p>
+            <w:r>
+              <w:rPr>
+                <w:rFonts w:hint="eastAsia"/>
+              </w:rPr>
+              <w:t>1</w:t>
+            </w:r>
+          </w:p>
+        </w:tc>
+        <w:tc>
+          <w:tcPr>
+            <w:tcW w:w="4739" w:type="dxa"/>
+          </w:tcPr>
+          <w:p>
+            <w:r>
+              <w:t xml:space="preserve">ID, 비밀번호, 이름, 전화번호, 이메일을 </w:t>
+            </w:r>
+            <w:proofErr w:type="spellStart"/>
+            <w:r>
+              <w:t>입력받아</w:t>
+            </w:r>
+            <w:proofErr w:type="spellEnd"/>
+            <w:r>
+              <w:t xml:space="preserve"> 회원가입을 진행한다.</w:t>
+            </w:r>
+          </w:p>
+        </w:tc>
+        <w:tc>
+          <w:tcPr>
+            <w:tcW w:w="3006" w:type="dxa"/>
+          </w:tcPr>
+          <w:p>
+            <w:r>
+              <w:t>회원 가입</w:t>
+            </w:r>
+          </w:p>
+        </w:tc>
+      </w:tr>
+      <w:tr>
+        <w:tc>
+          <w:tcPr>
+            <w:tcW w:w="1271" w:type="dxa"/>
+          </w:tcPr>
+          <w:p>
+            <w:r>
+              <w:rPr>
+                <w:rFonts w:hint="eastAsia"/>
+              </w:rPr>
+              <w:t>2</w:t>
+            </w:r>
+          </w:p>
+        </w:tc>
+        <w:tc>
+          <w:tcPr>
+            <w:tcW w:w="4739" w:type="dxa"/>
+          </w:tcPr>
+          <w:p>
+            <w:r>
+              <w:t>회원 탈퇴 버튼을 누르면 회원의 모든 이용 권한과 데이터를 삭제할 수 있다.</w:t>
+            </w:r>
+          </w:p>
+        </w:tc>
+        <w:tc>
+          <w:tcPr>
+            <w:tcW w:w="3006" w:type="dxa"/>
+          </w:tcPr>
+          <w:p>
+            <w:r>
+              <w:t>회원 탈퇴</w:t>
+            </w:r>
+          </w:p>
+        </w:tc>
+      </w:tr>
+      <w:tr>
+        <w:tc>
+          <w:tcPr>
+            <w:tcW w:w="1271" w:type="dxa"/>
+          </w:tcPr>
+          <w:p>
+            <w:r>
+              <w:rPr>
+                <w:rFonts w:hint="eastAsia"/>
+              </w:rPr>
+              <w:t>3</w:t>
+            </w:r>
+          </w:p>
+        </w:tc>
+        <w:tc>
+          <w:tcPr>
+            <w:tcW w:w="4739" w:type="dxa"/>
+          </w:tcPr>
+          <w:p>
+            <w:r>
+              <w:t>관리자와 회원은 ID와 비밀번호로 로그인할 수 있다.</w:t>
+            </w:r>
+          </w:p>
+        </w:tc>
+        <w:tc>
+          <w:tcPr>
+            <w:tcW w:w="3006" w:type="dxa"/>
+          </w:tcPr>
+          <w:p>
+            <w:r>
+              <w:rPr>
+                <w:rFonts w:hint="eastAsia"/>
+              </w:rPr>
+              <w:t>로그인</w:t>
+            </w:r>
+          </w:p>
+        </w:tc>
+      </w:tr>
+      <w:tr>
+        <w:tc>
+          <w:tcPr>
+            <w:tcW w:w="1271" w:type="dxa"/>
+          </w:tcPr>
+          <w:p>
+            <w:r>
+              <w:rPr>
+                <w:rFonts w:hint="eastAsia"/>
+              </w:rPr>
+              <w:t>4</w:t>
+            </w:r>
+          </w:p>
+        </w:tc>
+        <w:tc>
+          <w:tcPr>
+            <w:tcW w:w="4739" w:type="dxa"/>
+          </w:tcPr>
+          <w:p>
+            <w:r>
+              <w:t>관리자와 회원은 언제든 로그아웃 할 수 있다.</w:t>
+            </w:r>
+          </w:p>
+        </w:tc>
+        <w:tc>
+          <w:tcPr>
+            <w:tcW w:w="3006" w:type="dxa"/>
+          </w:tcPr>
+          <w:p>
+            <w:r>
+              <w:t>로그아웃</w:t>
+            </w:r>
+          </w:p>
+        </w:tc>
+      </w:tr>
+      <w:tr>
+        <w:tc>
+          <w:tcPr>
+            <w:tcW w:w="1271" w:type="dxa"/>
+          </w:tcPr>
+          <w:p>
+            <w:r>
+              <w:rPr>
+                <w:rFonts w:hint="eastAsia"/>
+              </w:rPr>
+              <w:t>5</w:t>
+            </w:r>
+          </w:p>
+        </w:tc>
+        <w:tc>
+          <w:tcPr>
+            <w:tcW w:w="4739" w:type="dxa"/>
+          </w:tcPr>
+          <w:p>
+            <w:r>
+              <w:t>관리자가 설문 제목, 설문 설명, 설문 문항, 응답 항목, 설문 시작 시각, 설문 마감 시각을 입력해 설문을 등록할 수 있다.</w:t>
+            </w:r>
+          </w:p>
+        </w:tc>
+        <w:tc>
+          <w:tcPr>
+            <w:tcW w:w="3006" w:type="dxa"/>
+          </w:tcPr>
+          <w:p>
+            <w:r>
+              <w:t>설문 등록</w:t>
+            </w:r>
+          </w:p>
+        </w:tc>
+      </w:tr>
+      <w:tr>
+        <w:tc>
+          <w:tcPr>
+            <w:tcW w:w="1271" w:type="dxa"/>
+          </w:tcPr>
+          <w:p>
+            <w:r>
+              <w:rPr>
+                <w:rFonts w:hint="eastAsia"/>
+              </w:rPr>
+              <w:t>6</w:t>
+            </w:r>
+          </w:p>
+        </w:tc>
+        <w:tc>
+          <w:tcPr>
+            <w:tcW w:w="4739" w:type="dxa"/>
+          </w:tcPr>
+          <w:p>
+            <w:r>
+              <w:t>관리자가 등록한 모든 설문 리스트를 조회할 수 있다.</w:t>
+            </w:r>
+          </w:p>
+        </w:tc>
+        <w:tc>
+          <w:tcPr>
+            <w:tcW w:w="3006" w:type="dxa"/>
+          </w:tcPr>
+          <w:p>
+            <w:r>
+              <w:t>설문 목록 조회</w:t>
+            </w:r>
+          </w:p>
+        </w:tc>
+      </w:tr>
+      <w:tr>
+        <w:tc>
+          <w:tcPr>
+            <w:tcW w:w="1271" w:type="dxa"/>
+          </w:tcPr>
+          <w:p>
+            <w:r>
+              <w:rPr>
+                <w:rFonts w:hint="eastAsia"/>
+              </w:rPr>
+              <w:lastRenderedPageBreak/>
+              <w:t>7</w:t>
+            </w:r>
+          </w:p>
+        </w:tc>
+        <w:tc>
+          <w:tcPr>
+            <w:tcW w:w="4739" w:type="dxa"/>
+          </w:tcPr>
+          <w:p>
+            <w:r>
+              <w:t>관리자는 원하는 설문 항목을 선택하여 상세 내용을 팝업 창으로 볼 수 있다.</w:t>
+            </w:r>
+          </w:p>
+        </w:tc>
+        <w:tc>
+          <w:tcPr>
+            <w:tcW w:w="3006" w:type="dxa"/>
+          </w:tcPr>
+          <w:p>
+            <w:r>
+              <w:t>설문 상세 조회</w:t>
+            </w:r>
+          </w:p>
+        </w:tc>
+      </w:tr>
+      <w:tr>
+        <w:tc>
+          <w:tcPr>
+            <w:tcW w:w="1271" w:type="dxa"/>
+          </w:tcPr>
+          <w:p>
+            <w:r>
+              <w:rPr>
+                <w:rFonts w:hint="eastAsia"/>
+              </w:rPr>
+              <w:t>8</w:t>
+            </w:r>
+          </w:p>
+        </w:tc>
+        <w:tc>
+          <w:tcPr>
+            <w:tcW w:w="4739" w:type="dxa"/>
           </w:tcPr>
           <w:p>
             <w:pPr>
-              <w:jc w:val="center"/>
+              <w:rPr>
+                <w:rFonts w:hint="eastAsia"/>
+              </w:rPr>
             </w:pPr>
-            <w:proofErr w:type="spellStart"/>
-            <w:r>
-              <w:rPr>
-                <w:rFonts w:hint="eastAsia"/>
-              </w:rPr>
-              <w:t>유스케이스</w:t>
-            </w:r>
-            <w:proofErr w:type="spellEnd"/>
-          </w:p>
-        </w:tc>
-        <w:tc>
-          <w:tcPr>
-            <w:tcW w:w="6044" w:type="dxa"/>
-            <w:shd w:val="clear" w:color="auto" w:fill="D9D9D9" w:themeFill="background1" w:themeFillShade="D9"/>
+            <w:r>
+              <w:t>관리자가 리스트 조회 화면에서 특정 설문 항목을 선택해서 삭제할 수 있다.</w:t>
+            </w:r>
+          </w:p>
+        </w:tc>
+        <w:tc>
+          <w:tcPr>
+            <w:tcW w:w="3006" w:type="dxa"/>
+          </w:tcPr>
+          <w:p>
+            <w:r>
+              <w:t>설문 삭제</w:t>
+            </w:r>
+          </w:p>
+        </w:tc>
+      </w:tr>
+      <w:tr>
+        <w:tc>
+          <w:tcPr>
+            <w:tcW w:w="1271" w:type="dxa"/>
+          </w:tcPr>
+          <w:p>
+            <w:r>
+              <w:rPr>
+                <w:rFonts w:hint="eastAsia"/>
+              </w:rPr>
+              <w:t>9</w:t>
+            </w:r>
+          </w:p>
+        </w:tc>
+        <w:tc>
+          <w:tcPr>
+            <w:tcW w:w="4739" w:type="dxa"/>
+          </w:tcPr>
+          <w:p>
+            <w:r>
+              <w:t>회원은 현재 진행 중인 설문 리스트, 향후 진행 예정인 설문 리스트, 종료된 설문 리스트 중 하나를 선택한 후 키워드를 입력하여 검색하면 결과로 조건에 맞는 설문 리스트가 출력된다.</w:t>
+            </w:r>
+          </w:p>
+        </w:tc>
+        <w:tc>
+          <w:tcPr>
+            <w:tcW w:w="3006" w:type="dxa"/>
+          </w:tcPr>
+          <w:p>
+            <w:r>
+              <w:t>설문 검색, 설문 종류 선택</w:t>
+            </w:r>
+          </w:p>
+        </w:tc>
+      </w:tr>
+      <w:tr>
+        <w:tc>
+          <w:tcPr>
+            <w:tcW w:w="1271" w:type="dxa"/>
           </w:tcPr>
           <w:p>
             <w:pPr>
-              <w:jc w:val="center"/>
+              <w:rPr>
+                <w:rFonts w:hint="eastAsia"/>
+              </w:rPr>
             </w:pPr>
             <w:r>
               <w:rPr>
                 <w:rFonts w:hint="eastAsia"/>
               </w:rPr>
-              <w:t>상세</w:t>
-            </w:r>
-          </w:p>
-        </w:tc>
-      </w:tr>
-      <w:tr>
-        <w:tc>
-          <w:tcPr>
-            <w:tcW w:w="2972" w:type="dxa"/>
+              <w:t>10</w:t>
+            </w:r>
+          </w:p>
+        </w:tc>
+        <w:tc>
+          <w:tcPr>
+            <w:tcW w:w="4739" w:type="dxa"/>
+          </w:tcPr>
+          <w:p>
+            <w:r>
+              <w:t>특정 설문을 선택하여 설문 제목, 설문 설명, 설문 문항, 응답 항목, 설문 시작 시간, 설문 마감 시각을 출력할 수 있다.</w:t>
+            </w:r>
+          </w:p>
+        </w:tc>
+        <w:tc>
+          <w:tcPr>
+            <w:tcW w:w="3006" w:type="dxa"/>
           </w:tcPr>
           <w:p>
             <w:pPr>
-              <w:jc w:val="center"/>
+              <w:rPr>
+                <w:rFonts w:hint="eastAsia"/>
+              </w:rPr>
             </w:pPr>
             <w:r>
-              <w:rPr>
-                <w:rFonts w:hint="eastAsia"/>
-              </w:rPr>
-              <w:t>회원 가입</w:t>
-            </w:r>
-          </w:p>
-        </w:tc>
-        <w:tc>
-          <w:tcPr>
-            <w:tcW w:w="6044" w:type="dxa"/>
+              <w:t>검색 설문 상세 조회</w:t>
+            </w:r>
+          </w:p>
+        </w:tc>
+      </w:tr>
+      <w:tr>
+        <w:tc>
+          <w:tcPr>
+            <w:tcW w:w="1271" w:type="dxa"/>
           </w:tcPr>
           <w:p>
             <w:pPr>
-              <w:jc w:val="center"/>
+              <w:rPr>
+                <w:rFonts w:hint="eastAsia"/>
+              </w:rPr>
             </w:pPr>
-          </w:p>
-        </w:tc>
-      </w:tr>
-      <w:tr>
-        <w:tc>
-          <w:tcPr>
-            <w:tcW w:w="2972" w:type="dxa"/>
+            <w:r>
+              <w:rPr>
+                <w:rFonts w:hint="eastAsia"/>
+              </w:rPr>
+              <w:t>11</w:t>
+            </w:r>
+          </w:p>
+        </w:tc>
+        <w:tc>
+          <w:tcPr>
+            <w:tcW w:w="4739" w:type="dxa"/>
+          </w:tcPr>
+          <w:p>
+            <w:r>
+              <w:t>현재 진행 중인 설문인 경우에는 응답 버튼이 활성화된다.</w:t>
+            </w:r>
+          </w:p>
+        </w:tc>
+        <w:tc>
+          <w:tcPr>
+            <w:tcW w:w="3006" w:type="dxa"/>
+          </w:tcPr>
+          <w:p>
+            <w:r>
+              <w:t>설문 검색</w:t>
+            </w:r>
+          </w:p>
+        </w:tc>
+      </w:tr>
+      <w:tr>
+        <w:tc>
+          <w:tcPr>
+            <w:tcW w:w="1271" w:type="dxa"/>
           </w:tcPr>
           <w:p>
             <w:pPr>
-              <w:jc w:val="center"/>
+              <w:rPr>
+                <w:rFonts w:hint="eastAsia"/>
+              </w:rPr>
             </w:pPr>
             <w:r>
               <w:rPr>
                 <w:rFonts w:hint="eastAsia"/>
               </w:rPr>
-              <w:t>회원 탈퇴</w:t>
-            </w:r>
-          </w:p>
-        </w:tc>
-        <w:tc>
-          <w:tcPr>
-            <w:tcW w:w="6044" w:type="dxa"/>
+              <w:t>12</w:t>
+            </w:r>
+          </w:p>
+        </w:tc>
+        <w:tc>
+          <w:tcPr>
+            <w:tcW w:w="4739" w:type="dxa"/>
+          </w:tcPr>
+          <w:p>
+            <w:r>
+              <w:t>회원이 응답 버튼을 누르면 응답 화면으로 이동하여 설문에 응답할 수 있으며 응답 버튼을 눌러서 완료한다.</w:t>
+            </w:r>
+          </w:p>
+        </w:tc>
+        <w:tc>
+          <w:tcPr>
+            <w:tcW w:w="3006" w:type="dxa"/>
+          </w:tcPr>
+          <w:p>
+            <w:r>
+              <w:t>설문 응답</w:t>
+            </w:r>
+          </w:p>
+        </w:tc>
+      </w:tr>
+      <w:tr>
+        <w:tc>
+          <w:tcPr>
+            <w:tcW w:w="1271" w:type="dxa"/>
           </w:tcPr>
           <w:p>
             <w:pPr>
-              <w:jc w:val="center"/>
+              <w:rPr>
+                <w:rFonts w:hint="eastAsia"/>
+              </w:rPr>
             </w:pPr>
-          </w:p>
-        </w:tc>
-      </w:tr>
-      <w:tr>
-        <w:tc>
-          <w:tcPr>
-            <w:tcW w:w="2972" w:type="dxa"/>
+            <w:r>
+              <w:rPr>
+                <w:rFonts w:hint="eastAsia"/>
+              </w:rPr>
+              <w:t>13</w:t>
+            </w:r>
+          </w:p>
+        </w:tc>
+        <w:tc>
+          <w:tcPr>
+            <w:tcW w:w="4739" w:type="dxa"/>
+          </w:tcPr>
+          <w:p>
+            <w:r>
+              <w:t>회원은 자신이 응답한 모든 설문 정보를 한 화면에서 조회할 수 있다. 각 응답한 설문에 대해 설문 제목, 응답 내용, 응답 일시 등이 출력된다.</w:t>
+            </w:r>
+          </w:p>
+        </w:tc>
+        <w:tc>
+          <w:tcPr>
+            <w:tcW w:w="3006" w:type="dxa"/>
+          </w:tcPr>
+          <w:p>
+            <w:r>
+              <w:t>응답한 설문 조회</w:t>
+            </w:r>
+          </w:p>
+        </w:tc>
+      </w:tr>
+      <w:tr>
+        <w:tc>
+          <w:tcPr>
+            <w:tcW w:w="1271" w:type="dxa"/>
           </w:tcPr>
           <w:p>
             <w:pPr>
-              <w:jc w:val="center"/>
+              <w:rPr>
+                <w:rFonts w:hint="eastAsia"/>
+              </w:rPr>
             </w:pPr>
             <w:r>
               <w:rPr>
                 <w:rFonts w:hint="eastAsia"/>
               </w:rPr>
-              <w:t>로그인</w:t>
-            </w:r>
-          </w:p>
-        </w:tc>
-        <w:tc>
-          <w:tcPr>
-            <w:tcW w:w="6044" w:type="dxa"/>
+              <w:t>14</w:t>
+            </w:r>
+          </w:p>
+        </w:tc>
+        <w:tc>
+          <w:tcPr>
+            <w:tcW w:w="4739" w:type="dxa"/>
           </w:tcPr>
           <w:p>
             <w:pPr>
-              <w:jc w:val="center"/>
+              <w:rPr>
+                <w:rFonts w:hint="eastAsia"/>
+              </w:rPr>
             </w:pPr>
-          </w:p>
-        </w:tc>
-      </w:tr>
-      <w:tr>
-        <w:tc>
-          <w:tcPr>
-            <w:tcW w:w="2972" w:type="dxa"/>
+            <w:r>
+              <w:t>현재 진행 중인 설문에 대해 자신이 제출한 응답을 수정할 수 있다. 설문 수정 화면에는 가장 최근에 수정한 날짜가 출력되어 있으며 수정 버튼을 눌러서 완료한다.</w:t>
+            </w:r>
+            <w:r>
+              <w:rPr>
+                <w:rFonts w:hint="eastAsia"/>
+              </w:rPr>
+              <w:t xml:space="preserve"> 단, 설문이 종료된 경우에는 수정할 수 없다.</w:t>
+            </w:r>
+          </w:p>
+        </w:tc>
+        <w:tc>
+          <w:tcPr>
+            <w:tcW w:w="3006" w:type="dxa"/>
+          </w:tcPr>
+          <w:p>
+            <w:r>
+              <w:t>응답 설문 수정</w:t>
+            </w:r>
+          </w:p>
+        </w:tc>
+      </w:tr>
+      <w:tr>
+        <w:tc>
+          <w:tcPr>
+            <w:tcW w:w="1271" w:type="dxa"/>
           </w:tcPr>
           <w:p>
             <w:pPr>
-              <w:jc w:val="center"/>
+              <w:rPr>
+                <w:rFonts w:hint="eastAsia"/>
+              </w:rPr>
             </w:pPr>
             <w:r>
               <w:rPr>
                 <w:rFonts w:hint="eastAsia"/>
               </w:rPr>
-              <w:t>로그아웃</w:t>
-            </w:r>
-          </w:p>
-        </w:tc>
-        <w:tc>
-          <w:tcPr>
-            <w:tcW w:w="6044" w:type="dxa"/>
+              <w:t>15</w:t>
+            </w:r>
+          </w:p>
+        </w:tc>
+        <w:tc>
+          <w:tcPr>
+            <w:tcW w:w="4739" w:type="dxa"/>
+          </w:tcPr>
+          <w:p>
+            <w:r>
+              <w:t>현재 진행 중인 설문에 대해서는 응답을 취소할 수 있다. 단, 설문이 종료된 경우에는 취소할 수 없다.</w:t>
+            </w:r>
+          </w:p>
+        </w:tc>
+        <w:tc>
+          <w:tcPr>
+            <w:tcW w:w="3006" w:type="dxa"/>
+          </w:tcPr>
+          <w:p>
+            <w:r>
+              <w:t>응답 설문 취소</w:t>
+            </w:r>
+          </w:p>
+        </w:tc>
+      </w:tr>
+      <w:tr>
+        <w:tc>
+          <w:tcPr>
+            <w:tcW w:w="1271" w:type="dxa"/>
           </w:tcPr>
           <w:p>
             <w:pPr>
-              <w:jc w:val="center"/>
+              <w:rPr>
+                <w:rFonts w:hint="eastAsia"/>
+              </w:rPr>
             </w:pPr>
-          </w:p>
-        </w:tc>
-      </w:tr>
-      <w:tr>
-        <w:tc>
-          <w:tcPr>
-            <w:tcW w:w="2972" w:type="dxa"/>
-          </w:tcPr>
-          <w:p>
-            <w:pPr>
-              <w:jc w:val="center"/>
-            </w:pPr>
-            <w:r>
-              <w:rPr>
-                <w:rFonts w:hint="eastAsia"/>
-              </w:rPr>
-              <w:t>설문 등록</w:t>
-            </w:r>
-          </w:p>
-        </w:tc>
-        <w:tc>
-          <w:tcPr>
-            <w:tcW w:w="6044" w:type="dxa"/>
-          </w:tcPr>
-          <w:p>
-            <w:pPr>
-              <w:jc w:val="center"/>
-            </w:pPr>
-          </w:p>
-        </w:tc>
-      </w:tr>
-      <w:tr>
-        <w:tc>
-          <w:tcPr>
-            <w:tcW w:w="2972" w:type="dxa"/>
-          </w:tcPr>
-          <w:p>
-            <w:pPr>
-              <w:jc w:val="center"/>
-            </w:pPr>
-            <w:r>
-              <w:rPr>
-                <w:rFonts w:hint="eastAsia"/>
-              </w:rPr>
-              <w:t>설문 조회</w:t>
-            </w:r>
-          </w:p>
-        </w:tc>
-        <w:tc>
-          <w:tcPr>
-            <w:tcW w:w="6044" w:type="dxa"/>
-          </w:tcPr>
-          <w:p>
-            <w:pPr>
-              <w:jc w:val="center"/>
-            </w:pPr>
-          </w:p>
-        </w:tc>
-      </w:tr>
-      <w:tr>
-        <w:tc>
-          <w:tcPr>
-            <w:tcW w:w="2972" w:type="dxa"/>
-          </w:tcPr>
-          <w:p>
-            <w:pPr>
-              <w:jc w:val="center"/>
-            </w:pPr>
-            <w:r>
-              <w:rPr>
-                <w:rFonts w:hint="eastAsia"/>
-              </w:rPr>
-              <w:t>설문 검색</w:t>
-            </w:r>
-          </w:p>
-        </w:tc>
-        <w:tc>
-          <w:tcPr>
-            <w:tcW w:w="6044" w:type="dxa"/>
-          </w:tcPr>
-          <w:p>
-            <w:pPr>
-              <w:jc w:val="center"/>
-            </w:pPr>
-          </w:p>
-        </w:tc>
-      </w:tr>
-      <w:tr>
-        <w:tc>
-          <w:tcPr>
-            <w:tcW w:w="2972" w:type="dxa"/>
-          </w:tcPr>
-          <w:p>
-            <w:pPr>
-              <w:jc w:val="center"/>
-            </w:pPr>
-            <w:r>
-              <w:rPr>
-                <w:rFonts w:hint="eastAsia"/>
-              </w:rPr>
-              <w:t>설문 상세정보 조회</w:t>
-            </w:r>
-          </w:p>
-        </w:tc>
-        <w:tc>
-          <w:tcPr>
-            <w:tcW w:w="6044" w:type="dxa"/>
-          </w:tcPr>
-          <w:p>
-            <w:pPr>
-              <w:jc w:val="center"/>
-            </w:pPr>
-          </w:p>
-        </w:tc>
-      </w:tr>
-      <w:tr>
-        <w:tc>
-          <w:tcPr>
-            <w:tcW w:w="2972" w:type="dxa"/>
-          </w:tcPr>
-          <w:p>
-            <w:pPr>
-              <w:jc w:val="center"/>
-            </w:pPr>
-            <w:r>
-              <w:rPr>
-                <w:rFonts w:hint="eastAsia"/>
-              </w:rPr>
-              <w:t>설문 응답</w:t>
-            </w:r>
-          </w:p>
-        </w:tc>
-        <w:tc>
-          <w:tcPr>
-            <w:tcW w:w="6044" w:type="dxa"/>
-          </w:tcPr>
-          <w:p>
-            <w:pPr>
-              <w:jc w:val="center"/>
-            </w:pPr>
-          </w:p>
-        </w:tc>
-      </w:tr>
-      <w:tr>
-        <w:tc>
-          <w:tcPr>
-            <w:tcW w:w="2972" w:type="dxa"/>
-          </w:tcPr>
-          <w:p>
-            <w:pPr>
-              <w:jc w:val="center"/>
-            </w:pPr>
-            <w:r>
-              <w:rPr>
-                <w:rFonts w:hint="eastAsia"/>
-              </w:rPr>
-              <w:t>응답한 설문 조회</w:t>
-            </w:r>
-          </w:p>
-        </w:tc>
-        <w:tc>
-          <w:tcPr>
-            <w:tcW w:w="6044" w:type="dxa"/>
-          </w:tcPr>
-          <w:p>
-            <w:pPr>
-              <w:jc w:val="center"/>
-            </w:pPr>
-          </w:p>
-        </w:tc>
-      </w:tr>
-      <w:tr>
-        <w:tc>
-          <w:tcPr>
-            <w:tcW w:w="2972" w:type="dxa"/>
-          </w:tcPr>
-          <w:p>
-            <w:pPr>
-              <w:jc w:val="center"/>
-            </w:pPr>
-            <w:r>
-              <w:rPr>
-                <w:rFonts w:hint="eastAsia"/>
-              </w:rPr>
-              <w:t>응답한 설문 수정 및 취소</w:t>
-            </w:r>
-          </w:p>
-        </w:tc>
-        <w:tc>
-          <w:tcPr>
-            <w:tcW w:w="6044" w:type="dxa"/>
-          </w:tcPr>
-          <w:p>
-            <w:pPr>
-              <w:jc w:val="center"/>
-            </w:pPr>
-          </w:p>
-        </w:tc>
-      </w:tr>
-      <w:tr>
-        <w:tc>
-          <w:tcPr>
-            <w:tcW w:w="2972" w:type="dxa"/>
-          </w:tcPr>
-          <w:p>
-            <w:pPr>
-              <w:jc w:val="center"/>
-            </w:pPr>
-            <w:r>
-              <w:rPr>
-                <w:rFonts w:hint="eastAsia"/>
-              </w:rPr>
-              <w:t>통계</w:t>
-            </w:r>
-          </w:p>
-        </w:tc>
-        <w:tc>
-          <w:tcPr>
-            <w:tcW w:w="6044" w:type="dxa"/>
-          </w:tcPr>
-          <w:p>
-            <w:pPr>
-              <w:jc w:val="center"/>
-            </w:pPr>
+            <w:r>
+              <w:rPr>
+                <w:rFonts w:hint="eastAsia"/>
+              </w:rPr>
+              <w:t>16</w:t>
+            </w:r>
+          </w:p>
+        </w:tc>
+        <w:tc>
+          <w:tcPr>
+            <w:tcW w:w="4739" w:type="dxa"/>
+          </w:tcPr>
+          <w:p>
+            <w:r>
+              <w:t>관리자는 설문 응답 통계 정보를 조회할 수 있다. 검색 단위를 최근 1주일, 1개월, 1년 중에서 선택하면 그 기간 동안 전체 설문 수, 종료된 설문 수, 총 응답 수가 출력된다.</w:t>
+            </w:r>
+          </w:p>
+        </w:tc>
+        <w:tc>
+          <w:tcPr>
+            <w:tcW w:w="3006" w:type="dxa"/>
+          </w:tcPr>
+          <w:p>
+            <w:r>
+              <w:t>통계 조회, 통계 조회 단위 변경</w:t>
+            </w:r>
           </w:p>
         </w:tc>
       </w:tr>
     </w:tbl>
-    <w:p>
-      <w:pPr>
-        <w:rPr>
-          <w:rFonts w:hint="eastAsia"/>
-        </w:rPr>
-      </w:pPr>
-    </w:p>
+    <w:p/>
     <w:sectPr>
       <w:pgSz w:w="11906" w:h="16838"/>
       <w:pgMar w:top="1701" w:right="1440" w:bottom="1440" w:left="1440" w:header="851" w:footer="992" w:gutter="0"/>
@@ -1681,7 +1877,6 @@
   <w:style w:type="character" w:default="1" w:styleId="a0">
     <w:name w:val="Default Paragraph Font"/>
     <w:uiPriority w:val="1"/>
-    <w:semiHidden/>
     <w:unhideWhenUsed/>
   </w:style>
   <w:style w:type="table" w:default="1" w:styleId="a1">

</xml_diff>

<commit_message>
UI 설계, Description 기술
- 요구사항 리스트 내용 수정
- UI 설계
- 유스케이스 기술서 작성
</commit_message>
<xml_diff>
--- a/requirement_list.docx
+++ b/requirement_list.docx
@@ -175,8 +175,34 @@
         <w:tc>
           <w:tcPr>
             <w:tcW w:w="5193" w:type="dxa"/>
-          </w:tcPr>
-          <w:p/>
+            <w:vMerge w:val="restart"/>
+          </w:tcPr>
+          <w:p>
+            <w:pPr>
+              <w:rPr>
+                <w:rFonts w:hint="eastAsia"/>
+              </w:rPr>
+            </w:pPr>
+            <w:r>
+              <w:rPr>
+                <w:rFonts w:hint="eastAsia"/>
+              </w:rPr>
+              <w:t>- Requirement list 기술 및 Use-case 도출</w:t>
+            </w:r>
+          </w:p>
+          <w:p>
+            <w:pPr>
+              <w:rPr>
+                <w:rFonts w:hint="eastAsia"/>
+              </w:rPr>
+            </w:pPr>
+            <w:r>
+              <w:rPr>
+                <w:rFonts w:hint="eastAsia"/>
+              </w:rPr>
+              <w:t>- 회원 가입, 회원 탈퇴, 로그인 Use-case에 대해 UI와 Description 제작</w:t>
+            </w:r>
+          </w:p>
         </w:tc>
       </w:tr>
       <w:tr>
@@ -207,6 +233,7 @@
         <w:tc>
           <w:tcPr>
             <w:tcW w:w="5193" w:type="dxa"/>
+            <w:vMerge/>
           </w:tcPr>
           <w:p/>
         </w:tc>
@@ -239,6 +266,7 @@
         <w:tc>
           <w:tcPr>
             <w:tcW w:w="5193" w:type="dxa"/>
+            <w:vMerge/>
           </w:tcPr>
           <w:p/>
         </w:tc>
@@ -277,8 +305,41 @@
         <w:tc>
           <w:tcPr>
             <w:tcW w:w="5193" w:type="dxa"/>
-          </w:tcPr>
-          <w:p/>
+            <w:vMerge w:val="restart"/>
+          </w:tcPr>
+          <w:p>
+            <w:pPr>
+              <w:rPr>
+                <w:rFonts w:hint="eastAsia"/>
+              </w:rPr>
+            </w:pPr>
+            <w:r>
+              <w:rPr>
+                <w:rFonts w:hint="eastAsia"/>
+              </w:rPr>
+              <w:t>- Requirement list 기술 및 Use-case 도출</w:t>
+            </w:r>
+          </w:p>
+          <w:p>
+            <w:r>
+              <w:rPr>
+                <w:rFonts w:hint="eastAsia"/>
+              </w:rPr>
+              <w:t xml:space="preserve">- </w:t>
+            </w:r>
+            <w:r>
+              <w:rPr>
+                <w:rFonts w:hint="eastAsia"/>
+              </w:rPr>
+              <w:t>설문 검색, 검색 설문 상세 조회, 로그아웃</w:t>
+            </w:r>
+            <w:r>
+              <w:rPr>
+                <w:rFonts w:hint="eastAsia"/>
+              </w:rPr>
+              <w:t xml:space="preserve"> Use-case에 대해 UI와 Description 제작</w:t>
+            </w:r>
+          </w:p>
         </w:tc>
       </w:tr>
       <w:tr>
@@ -309,6 +370,7 @@
         <w:tc>
           <w:tcPr>
             <w:tcW w:w="5193" w:type="dxa"/>
+            <w:vMerge/>
           </w:tcPr>
           <w:p/>
         </w:tc>
@@ -341,6 +403,7 @@
         <w:tc>
           <w:tcPr>
             <w:tcW w:w="5193" w:type="dxa"/>
+            <w:vMerge/>
           </w:tcPr>
           <w:p/>
         </w:tc>
@@ -379,8 +442,41 @@
         <w:tc>
           <w:tcPr>
             <w:tcW w:w="5193" w:type="dxa"/>
-          </w:tcPr>
-          <w:p/>
+            <w:vMerge w:val="restart"/>
+          </w:tcPr>
+          <w:p>
+            <w:pPr>
+              <w:rPr>
+                <w:rFonts w:hint="eastAsia"/>
+              </w:rPr>
+            </w:pPr>
+            <w:r>
+              <w:rPr>
+                <w:rFonts w:hint="eastAsia"/>
+              </w:rPr>
+              <w:t>- Requirement list 기술 및 Use-case 도출</w:t>
+            </w:r>
+          </w:p>
+          <w:p>
+            <w:r>
+              <w:rPr>
+                <w:rFonts w:hint="eastAsia"/>
+              </w:rPr>
+              <w:t xml:space="preserve">- </w:t>
+            </w:r>
+            <w:r>
+              <w:rPr>
+                <w:rFonts w:hint="eastAsia"/>
+              </w:rPr>
+              <w:t>응답한 설문 조회, 응답 설문 수정, 설문 응답</w:t>
+            </w:r>
+            <w:r>
+              <w:rPr>
+                <w:rFonts w:hint="eastAsia"/>
+              </w:rPr>
+              <w:t xml:space="preserve"> Use-case에 대해 UI와 Description 제작</w:t>
+            </w:r>
+          </w:p>
         </w:tc>
       </w:tr>
       <w:tr>
@@ -411,6 +507,7 @@
         <w:tc>
           <w:tcPr>
             <w:tcW w:w="5193" w:type="dxa"/>
+            <w:vMerge/>
           </w:tcPr>
           <w:p/>
         </w:tc>
@@ -443,6 +540,7 @@
         <w:tc>
           <w:tcPr>
             <w:tcW w:w="5193" w:type="dxa"/>
+            <w:vMerge/>
           </w:tcPr>
           <w:p/>
         </w:tc>
@@ -483,8 +581,41 @@
         <w:tc>
           <w:tcPr>
             <w:tcW w:w="5193" w:type="dxa"/>
-          </w:tcPr>
-          <w:p/>
+            <w:vMerge w:val="restart"/>
+          </w:tcPr>
+          <w:p>
+            <w:pPr>
+              <w:rPr>
+                <w:rFonts w:hint="eastAsia"/>
+              </w:rPr>
+            </w:pPr>
+            <w:r>
+              <w:rPr>
+                <w:rFonts w:hint="eastAsia"/>
+              </w:rPr>
+              <w:t>- Requirement list 기술 및 Use-case 도출</w:t>
+            </w:r>
+          </w:p>
+          <w:p>
+            <w:r>
+              <w:rPr>
+                <w:rFonts w:hint="eastAsia"/>
+              </w:rPr>
+              <w:t xml:space="preserve">- </w:t>
+            </w:r>
+            <w:r>
+              <w:rPr>
+                <w:rFonts w:hint="eastAsia"/>
+              </w:rPr>
+              <w:t>설문 등록, 설문 목록 조회, 통계 조회</w:t>
+            </w:r>
+            <w:r>
+              <w:rPr>
+                <w:rFonts w:hint="eastAsia"/>
+              </w:rPr>
+              <w:t xml:space="preserve"> Use-case에 대해 UI와 Description 제작</w:t>
+            </w:r>
+          </w:p>
         </w:tc>
       </w:tr>
       <w:tr>
@@ -515,6 +646,7 @@
         <w:tc>
           <w:tcPr>
             <w:tcW w:w="5193" w:type="dxa"/>
+            <w:vMerge/>
           </w:tcPr>
           <w:p/>
         </w:tc>
@@ -547,6 +679,7 @@
         <w:tc>
           <w:tcPr>
             <w:tcW w:w="5193" w:type="dxa"/>
+            <w:vMerge/>
           </w:tcPr>
           <w:p/>
         </w:tc>
@@ -591,8 +724,12 @@
         <w:tc>
           <w:tcPr>
             <w:tcW w:w="1271" w:type="dxa"/>
-          </w:tcPr>
-          <w:p>
+            <w:shd w:val="clear" w:color="auto" w:fill="D9D9D9" w:themeFill="background1" w:themeFillShade="D9"/>
+          </w:tcPr>
+          <w:p>
+            <w:pPr>
+              <w:jc w:val="center"/>
+            </w:pPr>
             <w:r>
               <w:rPr>
                 <w:rFonts w:hint="eastAsia"/>
@@ -604,8 +741,12 @@
         <w:tc>
           <w:tcPr>
             <w:tcW w:w="4739" w:type="dxa"/>
-          </w:tcPr>
-          <w:p>
+            <w:shd w:val="clear" w:color="auto" w:fill="D9D9D9" w:themeFill="background1" w:themeFillShade="D9"/>
+          </w:tcPr>
+          <w:p>
+            <w:pPr>
+              <w:jc w:val="center"/>
+            </w:pPr>
             <w:r>
               <w:rPr>
                 <w:rFonts w:hint="eastAsia"/>
@@ -617,8 +758,12 @@
         <w:tc>
           <w:tcPr>
             <w:tcW w:w="3006" w:type="dxa"/>
-          </w:tcPr>
-          <w:p>
+            <w:shd w:val="clear" w:color="auto" w:fill="D9D9D9" w:themeFill="background1" w:themeFillShade="D9"/>
+          </w:tcPr>
+          <w:p>
+            <w:pPr>
+              <w:jc w:val="center"/>
+            </w:pPr>
             <w:proofErr w:type="spellStart"/>
             <w:r>
               <w:rPr>
@@ -636,6 +781,9 @@
             <w:tcW w:w="1271" w:type="dxa"/>
           </w:tcPr>
           <w:p>
+            <w:pPr>
+              <w:jc w:val="center"/>
+            </w:pPr>
             <w:r>
               <w:rPr>
                 <w:rFonts w:hint="eastAsia"/>
@@ -679,6 +827,9 @@
             <w:tcW w:w="1271" w:type="dxa"/>
           </w:tcPr>
           <w:p>
+            <w:pPr>
+              <w:jc w:val="center"/>
+            </w:pPr>
             <w:r>
               <w:rPr>
                 <w:rFonts w:hint="eastAsia"/>
@@ -714,6 +865,9 @@
             <w:tcW w:w="1271" w:type="dxa"/>
           </w:tcPr>
           <w:p>
+            <w:pPr>
+              <w:jc w:val="center"/>
+            </w:pPr>
             <w:r>
               <w:rPr>
                 <w:rFonts w:hint="eastAsia"/>
@@ -752,6 +906,9 @@
             <w:tcW w:w="1271" w:type="dxa"/>
           </w:tcPr>
           <w:p>
+            <w:pPr>
+              <w:jc w:val="center"/>
+            </w:pPr>
             <w:r>
               <w:rPr>
                 <w:rFonts w:hint="eastAsia"/>
@@ -787,6 +944,9 @@
             <w:tcW w:w="1271" w:type="dxa"/>
           </w:tcPr>
           <w:p>
+            <w:pPr>
+              <w:jc w:val="center"/>
+            </w:pPr>
             <w:r>
               <w:rPr>
                 <w:rFonts w:hint="eastAsia"/>
@@ -822,6 +982,9 @@
             <w:tcW w:w="1271" w:type="dxa"/>
           </w:tcPr>
           <w:p>
+            <w:pPr>
+              <w:jc w:val="center"/>
+            </w:pPr>
             <w:r>
               <w:rPr>
                 <w:rFonts w:hint="eastAsia"/>
@@ -857,6 +1020,9 @@
             <w:tcW w:w="1271" w:type="dxa"/>
           </w:tcPr>
           <w:p>
+            <w:pPr>
+              <w:jc w:val="center"/>
+            </w:pPr>
             <w:r>
               <w:rPr>
                 <w:rFonts w:hint="eastAsia"/>
@@ -893,6 +1059,9 @@
             <w:tcW w:w="1271" w:type="dxa"/>
           </w:tcPr>
           <w:p>
+            <w:pPr>
+              <w:jc w:val="center"/>
+            </w:pPr>
             <w:r>
               <w:rPr>
                 <w:rFonts w:hint="eastAsia"/>
@@ -906,11 +1075,6 @@
             <w:tcW w:w="4739" w:type="dxa"/>
           </w:tcPr>
           <w:p>
-            <w:pPr>
-              <w:rPr>
-                <w:rFonts w:hint="eastAsia"/>
-              </w:rPr>
-            </w:pPr>
             <w:r>
               <w:t>관리자가 리스트 조회 화면에서 특정 설문 항목을 선택해서 삭제할 수 있다.</w:t>
             </w:r>
@@ -933,6 +1097,9 @@
             <w:tcW w:w="1271" w:type="dxa"/>
           </w:tcPr>
           <w:p>
+            <w:pPr>
+              <w:jc w:val="center"/>
+            </w:pPr>
             <w:r>
               <w:rPr>
                 <w:rFonts w:hint="eastAsia"/>
@@ -969,9 +1136,7 @@
           </w:tcPr>
           <w:p>
             <w:pPr>
-              <w:rPr>
-                <w:rFonts w:hint="eastAsia"/>
-              </w:rPr>
+              <w:jc w:val="center"/>
             </w:pPr>
             <w:r>
               <w:rPr>
@@ -996,11 +1161,6 @@
             <w:tcW w:w="3006" w:type="dxa"/>
           </w:tcPr>
           <w:p>
-            <w:pPr>
-              <w:rPr>
-                <w:rFonts w:hint="eastAsia"/>
-              </w:rPr>
-            </w:pPr>
             <w:r>
               <w:t>검색 설문 상세 조회</w:t>
             </w:r>
@@ -1014,9 +1174,7 @@
           </w:tcPr>
           <w:p>
             <w:pPr>
-              <w:rPr>
-                <w:rFonts w:hint="eastAsia"/>
-              </w:rPr>
+              <w:jc w:val="center"/>
             </w:pPr>
             <w:r>
               <w:rPr>
@@ -1054,9 +1212,7 @@
           </w:tcPr>
           <w:p>
             <w:pPr>
-              <w:rPr>
-                <w:rFonts w:hint="eastAsia"/>
-              </w:rPr>
+              <w:jc w:val="center"/>
             </w:pPr>
             <w:r>
               <w:rPr>
@@ -1094,9 +1250,7 @@
           </w:tcPr>
           <w:p>
             <w:pPr>
-              <w:rPr>
-                <w:rFonts w:hint="eastAsia"/>
-              </w:rPr>
+              <w:jc w:val="center"/>
             </w:pPr>
             <w:r>
               <w:rPr>
@@ -1134,9 +1288,7 @@
           </w:tcPr>
           <w:p>
             <w:pPr>
-              <w:rPr>
-                <w:rFonts w:hint="eastAsia"/>
-              </w:rPr>
+              <w:jc w:val="center"/>
             </w:pPr>
             <w:r>
               <w:rPr>
@@ -1151,11 +1303,6 @@
             <w:tcW w:w="4739" w:type="dxa"/>
           </w:tcPr>
           <w:p>
-            <w:pPr>
-              <w:rPr>
-                <w:rFonts w:hint="eastAsia"/>
-              </w:rPr>
-            </w:pPr>
             <w:r>
               <w:t>현재 진행 중인 설문에 대해 자신이 제출한 응답을 수정할 수 있다. 설문 수정 화면에는 가장 최근에 수정한 날짜가 출력되어 있으며 수정 버튼을 눌러서 완료한다.</w:t>
             </w:r>
@@ -1185,9 +1332,7 @@
           </w:tcPr>
           <w:p>
             <w:pPr>
-              <w:rPr>
-                <w:rFonts w:hint="eastAsia"/>
-              </w:rPr>
+              <w:jc w:val="center"/>
             </w:pPr>
             <w:r>
               <w:rPr>
@@ -1225,9 +1370,7 @@
           </w:tcPr>
           <w:p>
             <w:pPr>
-              <w:rPr>
-                <w:rFonts w:hint="eastAsia"/>
-              </w:rPr>
+              <w:jc w:val="center"/>
             </w:pPr>
             <w:r>
               <w:rPr>
@@ -1268,6 +1411,56 @@
     </w:sectPr>
   </w:body>
 </w:document>
+</file>
+
+<file path=word/endnotes.xml><?xml version="1.0" encoding="utf-8"?>
+<w:endnotes xmlns:wpc="http://schemas.microsoft.com/office/word/2010/wordprocessingCanvas" xmlns:cx="http://schemas.microsoft.com/office/drawing/2014/chartex" xmlns:cx1="http://schemas.microsoft.com/office/drawing/2015/9/8/chartex" xmlns:cx2="http://schemas.microsoft.com/office/drawing/2015/10/21/chartex" xmlns:cx3="http://schemas.microsoft.com/office/drawing/2016/5/9/chartex" xmlns:cx4="http://schemas.microsoft.com/office/drawing/2016/5/10/chartex" xmlns:cx5="http://schemas.microsoft.com/office/drawing/2016/5/11/chartex" xmlns:cx6="http://schemas.microsoft.com/office/drawing/2016/5/12/chartex" xmlns:cx7="http://schemas.microsoft.com/office/drawing/2016/5/13/chartex" xmlns:cx8="http://schemas.microsoft.com/office/drawing/2016/5/14/chartex" xmlns:mc="http://schemas.openxmlformats.org/markup-compatibility/2006" xmlns:aink="http://schemas.microsoft.com/office/drawing/2016/ink" xmlns:am3d="http://schemas.microsoft.com/office/drawing/2017/model3d" xmlns:o="urn:schemas-microsoft-com:office:office" xmlns:oel="http://schemas.microsoft.com/office/2019/extlst" xmlns:r="http://schemas.openxmlformats.org/officeDocument/2006/relationships" xmlns:m="http://schemas.openxmlformats.org/officeDocument/2006/math" xmlns:v="urn:schemas-microsoft-com:vml" xmlns:wp14="http://schemas.microsoft.com/office/word/2010/wordprocessingDrawing" xmlns:wp="http://schemas.openxmlformats.org/drawingml/2006/wordprocessingDrawing" xmlns:w10="urn:schemas-microsoft-com:office:word" xmlns:w="http://schemas.openxmlformats.org/wordprocessingml/2006/main" xmlns:w14="http://schemas.microsoft.com/office/word/2010/wordml" xmlns:w15="http://schemas.microsoft.com/office/word/2012/wordml" xmlns:w16cex="http://schemas.microsoft.com/office/word/2018/wordml/cex" xmlns:w16cid="http://schemas.microsoft.com/office/word/2016/wordml/cid" xmlns:w16="http://schemas.microsoft.com/office/word/2018/wordml" xmlns:w16du="http://schemas.microsoft.com/office/word/2023/wordml/word16du" xmlns:w16sdtdh="http://schemas.microsoft.com/office/word/2020/wordml/sdtdatahash" xmlns:w16sdtfl="http://schemas.microsoft.com/office/word/2024/wordml/sdtformatlock" xmlns:w16se="http://schemas.microsoft.com/office/word/2015/wordml/symex" xmlns:wpg="http://schemas.microsoft.com/office/word/2010/wordprocessingGroup" xmlns:wpi="http://schemas.microsoft.com/office/word/2010/wordprocessingInk" xmlns:wne="http://schemas.microsoft.com/office/word/2006/wordml" xmlns:wps="http://schemas.microsoft.com/office/word/2010/wordprocessingShape" mc:Ignorable="w14 w15 w16se w16cid w16 w16cex w16sdtdh w16sdtfl w16du wp14">
+  <w:endnote w:type="separator" w:id="-1">
+    <w:p>
+      <w:pPr>
+        <w:spacing w:after="0"/>
+      </w:pPr>
+      <w:r>
+        <w:separator/>
+      </w:r>
+    </w:p>
+  </w:endnote>
+  <w:endnote w:type="continuationSeparator" w:id="0">
+    <w:p>
+      <w:pPr>
+        <w:spacing w:after="0"/>
+      </w:pPr>
+      <w:r>
+        <w:continuationSeparator/>
+      </w:r>
+    </w:p>
+  </w:endnote>
+</w:endnotes>
+</file>
+
+<file path=word/footnotes.xml><?xml version="1.0" encoding="utf-8"?>
+<w:footnotes xmlns:wpc="http://schemas.microsoft.com/office/word/2010/wordprocessingCanvas" xmlns:cx="http://schemas.microsoft.com/office/drawing/2014/chartex" xmlns:cx1="http://schemas.microsoft.com/office/drawing/2015/9/8/chartex" xmlns:cx2="http://schemas.microsoft.com/office/drawing/2015/10/21/chartex" xmlns:cx3="http://schemas.microsoft.com/office/drawing/2016/5/9/chartex" xmlns:cx4="http://schemas.microsoft.com/office/drawing/2016/5/10/chartex" xmlns:cx5="http://schemas.microsoft.com/office/drawing/2016/5/11/chartex" xmlns:cx6="http://schemas.microsoft.com/office/drawing/2016/5/12/chartex" xmlns:cx7="http://schemas.microsoft.com/office/drawing/2016/5/13/chartex" xmlns:cx8="http://schemas.microsoft.com/office/drawing/2016/5/14/chartex" xmlns:mc="http://schemas.openxmlformats.org/markup-compatibility/2006" xmlns:aink="http://schemas.microsoft.com/office/drawing/2016/ink" xmlns:am3d="http://schemas.microsoft.com/office/drawing/2017/model3d" xmlns:o="urn:schemas-microsoft-com:office:office" xmlns:oel="http://schemas.microsoft.com/office/2019/extlst" xmlns:r="http://schemas.openxmlformats.org/officeDocument/2006/relationships" xmlns:m="http://schemas.openxmlformats.org/officeDocument/2006/math" xmlns:v="urn:schemas-microsoft-com:vml" xmlns:wp14="http://schemas.microsoft.com/office/word/2010/wordprocessingDrawing" xmlns:wp="http://schemas.openxmlformats.org/drawingml/2006/wordprocessingDrawing" xmlns:w10="urn:schemas-microsoft-com:office:word" xmlns:w="http://schemas.openxmlformats.org/wordprocessingml/2006/main" xmlns:w14="http://schemas.microsoft.com/office/word/2010/wordml" xmlns:w15="http://schemas.microsoft.com/office/word/2012/wordml" xmlns:w16cex="http://schemas.microsoft.com/office/word/2018/wordml/cex" xmlns:w16cid="http://schemas.microsoft.com/office/word/2016/wordml/cid" xmlns:w16="http://schemas.microsoft.com/office/word/2018/wordml" xmlns:w16du="http://schemas.microsoft.com/office/word/2023/wordml/word16du" xmlns:w16sdtdh="http://schemas.microsoft.com/office/word/2020/wordml/sdtdatahash" xmlns:w16sdtfl="http://schemas.microsoft.com/office/word/2024/wordml/sdtformatlock" xmlns:w16se="http://schemas.microsoft.com/office/word/2015/wordml/symex" xmlns:wpg="http://schemas.microsoft.com/office/word/2010/wordprocessingGroup" xmlns:wpi="http://schemas.microsoft.com/office/word/2010/wordprocessingInk" xmlns:wne="http://schemas.microsoft.com/office/word/2006/wordml" xmlns:wps="http://schemas.microsoft.com/office/word/2010/wordprocessingShape" mc:Ignorable="w14 w15 w16se w16cid w16 w16cex w16sdtdh w16sdtfl w16du wp14">
+  <w:footnote w:type="separator" w:id="-1">
+    <w:p>
+      <w:pPr>
+        <w:spacing w:after="0"/>
+      </w:pPr>
+      <w:r>
+        <w:separator/>
+      </w:r>
+    </w:p>
+  </w:footnote>
+  <w:footnote w:type="continuationSeparator" w:id="0">
+    <w:p>
+      <w:pPr>
+        <w:spacing w:after="0"/>
+      </w:pPr>
+      <w:r>
+        <w:continuationSeparator/>
+      </w:r>
+    </w:p>
+  </w:footnote>
+</w:footnotes>
 </file>
 
 <file path=word/styles.xml><?xml version="1.0" encoding="utf-8"?>
@@ -1877,6 +2070,7 @@
   <w:style w:type="character" w:default="1" w:styleId="a0">
     <w:name w:val="Default Paragraph Font"/>
     <w:uiPriority w:val="1"/>
+    <w:semiHidden/>
     <w:unhideWhenUsed/>
   </w:style>
   <w:style w:type="table" w:default="1" w:styleId="a1">
@@ -2203,6 +2397,50 @@
         <w:insideV w:val="single" w:sz="4" w:space="0" w:color="auto"/>
       </w:tblBorders>
     </w:tblPr>
+  </w:style>
+  <w:style w:type="paragraph" w:styleId="ab">
+    <w:name w:val="header"/>
+    <w:basedOn w:val="a"/>
+    <w:link w:val="Char3"/>
+    <w:uiPriority w:val="99"/>
+    <w:unhideWhenUsed/>
+    <w:rsid w:val="00352831"/>
+    <w:pPr>
+      <w:tabs>
+        <w:tab w:val="center" w:pos="4513"/>
+        <w:tab w:val="right" w:pos="9026"/>
+      </w:tabs>
+      <w:snapToGrid w:val="0"/>
+    </w:pPr>
+  </w:style>
+  <w:style w:type="character" w:customStyle="1" w:styleId="Char3">
+    <w:name w:val="머리글 Char"/>
+    <w:basedOn w:val="a0"/>
+    <w:link w:val="ab"/>
+    <w:uiPriority w:val="99"/>
+    <w:rsid w:val="00352831"/>
+  </w:style>
+  <w:style w:type="paragraph" w:styleId="ac">
+    <w:name w:val="footer"/>
+    <w:basedOn w:val="a"/>
+    <w:link w:val="Char4"/>
+    <w:uiPriority w:val="99"/>
+    <w:unhideWhenUsed/>
+    <w:rsid w:val="00352831"/>
+    <w:pPr>
+      <w:tabs>
+        <w:tab w:val="center" w:pos="4513"/>
+        <w:tab w:val="right" w:pos="9026"/>
+      </w:tabs>
+      <w:snapToGrid w:val="0"/>
+    </w:pPr>
+  </w:style>
+  <w:style w:type="character" w:customStyle="1" w:styleId="Char4">
+    <w:name w:val="바닥글 Char"/>
+    <w:basedOn w:val="a0"/>
+    <w:link w:val="ac"/>
+    <w:uiPriority w:val="99"/>
+    <w:rsid w:val="00352831"/>
   </w:style>
 </w:styles>
 </file>

</xml_diff>